<commit_message>
docs(repo): add instructor Engr. Mervin John Tampus to design document
## Why

The Software Design Document title metadata requires the instructor's name for
formal course submission in Software Design at Cebu Institute of Technology –
University.

## Key Changes

- 06-software-design-document/SOFTWARE-DESIGN-DOCUMENT.md: added Course & Section
  and Instructor (Engr. Mervin John Tampus) to the metadata table.
- 06-software-design-document/SEIskolar-Software-Design-Document.docx: recompiled
  the Word deliverable with the updated metadata.

## Verification

- Recompiled SEIskolar-Software-Design-Document.docx and confirmed zero running
  headers or footers.
- Ran prettier --check on SOFTWARE-DESIGN-DOCUMENT.md (passes cleanly).

Co-Authored-By: Antigravity <noreply@google.com>
</commit_message>
<xml_diff>
--- a/06-software-design-document/SEIskolar-Software-Design-Document.docx
+++ b/06-software-design-document/SEIskolar-Software-Design-Document.docx
@@ -118,6 +118,54 @@
             </w:r>
             <w:r>
               <w:t xml:space="preserve">: Adrian Seth Tabotabo (Project Manager), Genril Theo Soroño, Althea Maeve Kinaadman, Zedric Camilotes, Dorothy Biatriz Capao</w:t>
+            </w:r>
+          </w:p>
+        </w:tc>
+      </w:tr>
+      <w:tr>
+        <w:tc>
+          <w:tcPr/>
+          <w:p>
+            <w:pPr>
+              <w:pStyle w:val="Compact"/>
+            </w:pPr>
+            <w:r>
+              <w:t xml:space="preserve">Course &amp; Section</w:t>
+            </w:r>
+          </w:p>
+        </w:tc>
+        <w:tc>
+          <w:tcPr/>
+          <w:p>
+            <w:pPr>
+              <w:pStyle w:val="Compact"/>
+            </w:pPr>
+            <w:r>
+              <w:t xml:space="preserve">Software Design, Cebu Institute of Technology – University (CIT-U)</w:t>
+            </w:r>
+          </w:p>
+        </w:tc>
+      </w:tr>
+      <w:tr>
+        <w:tc>
+          <w:tcPr/>
+          <w:p>
+            <w:pPr>
+              <w:pStyle w:val="Compact"/>
+            </w:pPr>
+            <w:r>
+              <w:t xml:space="preserve">Instructor</w:t>
+            </w:r>
+          </w:p>
+        </w:tc>
+        <w:tc>
+          <w:tcPr/>
+          <w:p>
+            <w:pPr>
+              <w:pStyle w:val="Compact"/>
+            </w:pPr>
+            <w:r>
+              <w:t xml:space="preserve">Engr. Mervin John Tampus</w:t>
             </w:r>
           </w:p>
         </w:tc>

</xml_diff>